<commit_message>
Pro se draft: lead with timeliness, keep leave to file late as fallback
Co-Authored-By: Claude Sonnet 5.5 <noreply@anthropic.com>
Claude-Session: https://claude.ai/code/session_019TLqP2S94uHc4BMEoK9cMK
</commit_message>
<xml_diff>
--- a/case-files/kumar-v-us/research-output/KUMAR-PROSE-RESPONSE-DRAFT.docx
+++ b/case-files/kumar-v-us/research-output/KUMAR-PROSE-RESPONSE-DRAFT.docx
@@ -172,7 +172,7 @@
           <w:rFonts w:ascii="Times New Roman" w:hAnsi="Times New Roman" w:cs="Times New Roman"/>
           <w:sz w:val="22"/>
         </w:rPr>
-        <w:t xml:space="preserve"> (a) concedes that no proffer letter would have protected the February 27, 2020 false statements (Count 3), as Kumar’s own brief already does; (b) does not ask to vacate the 9/30 stay (a plain denial of the motion ends it in practice; a request to vacate would be a separate fight); (c) does not apply to expand the certificate of appealability; Part IV.F is a neutral reservation that neither concedes nor asserts any defect in Judge Wolf’s certificate; (d) does not mention that Kumar filed his opening brief on 8/24/2026, a week after the 8/17 briefing schedule (the Government may raise it); (e) delay claim is kept short and does not argue the ECF 58-1 exhibits, which hurt on motive (the 7/30/2020 emails about pushing out the indictment deadline for plea negotiations).</w:t>
+        <w:t xml:space="preserve"> (a) concedes that no proffer letter would have protected the February 27, 2020 false statements (Count 3), as Kumar’s own brief already does; (b) does not ask to vacate the 9/30 stay (a plain denial of the motion ends it in practice; a request to vacate would be a separate fight); (c) does not apply to expand the certificate of appealability; Part IV.F is a neutral reservation that neither concedes nor asserts any defect in Judge Wolf’s certificate; (d) does not mention that Kumar filed his opening brief on 8/24/2026, a week after the 8/17 briefing schedule (the Government may raise it); (e) timeliness is argued first (the docket shows no order setting a response date, and no rule I found requires the court to set one; FRAP 27(a)(3)(A) runs 10 days automatically unless the court extends it), with leave under FRAP 26(b) kept as a fallback in the same filing; (f) delay claim is kept short and does not argue the ECF 58-1 exhibits, which hurt on motive (the 7/30/2020 emails about pushing out the indictment deadline for plea negotiations).</w:t>
       </w:r>
     </w:p>
     <w:p>
@@ -309,20 +309,20 @@
           <w:b/>
           <w:sz w:val="28"/>
         </w:rPr>
-        <w:t xml:space="preserve">APPELLANT’S MOTION FOR LEAVE TO FILE RESPONSE OUT OF TIME AND RESPONSE IN OPPOSITION TO APPELLEE’S MOTION FOR SUMMARY DISPOSITION</w:t>
-      </w:r>
-    </w:p>
-    <w:p>
-      <w:pPr>
-        <w:spacing w:after="240" w:line="480" w:lineRule="auto"/>
-        <w:jc w:val="left"/>
-      </w:pPr>
-      <w:r>
-        <w:rPr>
-          <w:rFonts w:ascii="Times New Roman" w:hAnsi="Times New Roman" w:cs="Times New Roman"/>
-          <w:sz w:val="28"/>
-        </w:rPr>
-        <w:t xml:space="preserve">Appellant Manish Kumar, pro se, asks the Court (1) for leave under Fed. R. App. P. 26(b) to file this response after the date it was due, and (2) to deny the Government’s motion for summary disposition under 1st Cir. R. 27.0(c). On September 30, 2026, the Court granted the Government’s motion to stay briefing as unopposed. The Court has not ruled on the motion for summary disposition.</w:t>
+        <w:t xml:space="preserve">APPELLANT’S RESPONSE IN OPPOSITION TO APPELLEE’S MOTION FOR SUMMARY DISPOSITION AND, TO THE EXTENT NECESSARY, MOTION FOR LEAVE TO FILE OUT OF TIME</w:t>
+      </w:r>
+    </w:p>
+    <w:p>
+      <w:pPr>
+        <w:spacing w:after="240" w:line="480" w:lineRule="auto"/>
+        <w:jc w:val="left"/>
+      </w:pPr>
+      <w:r>
+        <w:rPr>
+          <w:rFonts w:ascii="Times New Roman" w:hAnsi="Times New Roman" w:cs="Times New Roman"/>
+          <w:sz w:val="28"/>
+        </w:rPr>
+        <w:t xml:space="preserve">Appellant Manish Kumar, pro se, asks the Court to deny the Government’s motion for summary disposition under 1st Cir. R. 27.0(c). The Court has not set a date for a response to that motion, and has not ruled on it. To the extent the Court considers this response late, Mr. Kumar asks for leave under Fed. R. App. P. 26(b) to file it now.</w:t>
       </w:r>
     </w:p>
     <w:p>
@@ -337,33 +337,33 @@
           <w:b/>
           <w:sz w:val="28"/>
         </w:rPr>
-        <w:t xml:space="preserve">I. MOTION FOR LEAVE TO FILE OUT OF TIME</w:t>
-      </w:r>
-    </w:p>
-    <w:p>
-      <w:pPr>
-        <w:spacing w:after="240" w:line="480" w:lineRule="auto"/>
-        <w:jc w:val="left"/>
-      </w:pPr>
-      <w:r>
-        <w:rPr>
-          <w:rFonts w:ascii="Times New Roman" w:hAnsi="Times New Roman" w:cs="Times New Roman"/>
-          <w:sz w:val="28"/>
-        </w:rPr>
-        <w:t xml:space="preserve">1. The Government served its motion by first-class mail on September 11, 2026, addressed to Mr. Kumar at FCI Fort Dix. (Gov’t Mot. for Summary Disposition, Certificate of Service.) A response to a motion is due 10 days after service, Fed. R. App. P. 27(a)(3)(A), plus three days when service is by mail, Fed. R. App. P. 26(c). That date was September 24, 2026.</w:t>
-      </w:r>
-    </w:p>
-    <w:p>
-      <w:pPr>
-        <w:spacing w:after="240" w:line="480" w:lineRule="auto"/>
-        <w:jc w:val="left"/>
-      </w:pPr>
-      <w:r>
-        <w:rPr>
-          <w:rFonts w:ascii="Times New Roman" w:hAnsi="Times New Roman" w:cs="Times New Roman"/>
-          <w:sz w:val="28"/>
-        </w:rPr>
-        <w:t xml:space="preserve">2. Rule 26(b) provides that “[f]or good cause, the court may extend the time prescribed by these rules or by its order to perform any act, or may permit an act to be done after that time expires.”</w:t>
+        <w:t xml:space="preserve">I. THIS RESPONSE IS TIMELY; ALTERNATIVELY, THERE IS GOOD CAUSE FOR LEAVE</w:t>
+      </w:r>
+    </w:p>
+    <w:p>
+      <w:pPr>
+        <w:spacing w:after="240" w:line="480" w:lineRule="auto"/>
+        <w:jc w:val="left"/>
+      </w:pPr>
+      <w:r>
+        <w:rPr>
+          <w:rFonts w:ascii="Times New Roman" w:hAnsi="Times New Roman" w:cs="Times New Roman"/>
+          <w:sz w:val="28"/>
+        </w:rPr>
+        <w:t xml:space="preserve">1. The Government served its motion by first-class mail on September 11, 2026, addressed to Mr. Kumar at FCI Fort Dix. (Gov’t Mot. for Summary Disposition, Certificate of Service.) Mr. Kumar is a pro se prisoner and is not a participant in the Court’s electronic filing system. The docket reflects no order setting a date for a response to the motion, no order ruling on it, and no notice to Mr. Kumar of any deadline. The only action since the motion was filed is the September 30, 2026 order granting the Government’s separate motion to stay briefing as unopposed. Mr. Kumar submits that, in these circumstances, this response is timely.</w:t>
+      </w:r>
+    </w:p>
+    <w:p>
+      <w:pPr>
+        <w:spacing w:after="240" w:line="480" w:lineRule="auto"/>
+        <w:jc w:val="left"/>
+      </w:pPr>
+      <w:r>
+        <w:rPr>
+          <w:rFonts w:ascii="Times New Roman" w:hAnsi="Times New Roman" w:cs="Times New Roman"/>
+          <w:sz w:val="28"/>
+        </w:rPr>
+        <w:t xml:space="preserve">2. If the Court nonetheless applies the 10-day period of Fed. R. App. P. 27(a)(3)(A), plus the three days Rule 26(c) adds for service by mail, that period ended on September 24, 2026. In that event Mr. Kumar asks for leave to file now. Rule 26(b) provides that “[f]or good cause, the court may extend the time prescribed by these rules or by its order to perform any act, or may permit an act to be done after that time expires.”</w:t>
       </w:r>
     </w:p>
     <w:p>
@@ -1097,7 +1097,7 @@
           <w:rFonts w:ascii="Times New Roman" w:hAnsi="Times New Roman" w:cs="Times New Roman"/>
           <w:sz w:val="28"/>
         </w:rPr>
-        <w:t xml:space="preserve">This document complies with the type-volume limit of Fed. R. App. P. 27(d)(2)(A) because, excluding the parts exempted by Fed. R. App. P. 32(f), it contains approximately 2338 words [RECOUNT AFTER FINAL EDITS], and with the typeface and type-style requirements of Fed. R. App. P. 32(a)(5) and (6) because it is prepared in a proportionally spaced typeface (Times New Roman, 14 point).</w:t>
+        <w:t xml:space="preserve">This document complies with the type-volume limit of Fed. R. App. P. 27(d)(2)(A) because, excluding the parts exempted by Fed. R. App. P. 32(f), it contains approximately 2429 words [RECOUNT AFTER FINAL EDITS], and with the typeface and type-style requirements of Fed. R. App. P. 32(a)(5) and (6) because it is prepared in a proportionally spaced typeface (Times New Roman, 14 point).</w:t>
       </w:r>
     </w:p>
     <w:p>

</xml_diff>